<commit_message>
Word templates: always expose quantity_total; fix sample generator cells; ensure Data is built
Co-Authored-By: Claude Fable 5.1 <noreply@anthropic.com>
</commit_message>
<xml_diff>
--- a/docs/templates/invoice-simple.docx
+++ b/docs/templates/invoice-simple.docx
@@ -62,8 +62,48 @@
               <w:spacing w:before="0" w:after="0"/>
             </w:pPr>
             <w:r>
-              <w:rPr/>
-              <w:t xml:space="preserve">&lt;w:p&gt;&lt;w:pPr&gt;&lt;w:spacing w:before="0" w:after="0"/&gt;&lt;/w:pPr&gt;&lt;w:r&gt;&lt;w:rPr&gt;&lt;w:b/&gt;&lt;w:sz w:val="24"/&gt;&lt;w:szCs w:val="24"/&gt;&lt;/w:rPr&gt;&lt;w:t xml:space="preserve"&gt;{{company.name}}&lt;/w:t&gt;&lt;/w:r&gt;&lt;/w:p&gt;&lt;w:p&gt;&lt;w:pPr&gt;&lt;w:spacing w:before="0" w:after="0"/&gt;&lt;/w:pPr&gt;&lt;w:r&gt;&lt;w:rPr&gt;&lt;/w:rPr&gt;&lt;w:t xml:space="preserve"&gt;{{company.address1}}&lt;/w:t&gt;&lt;/w:r&gt;&lt;/w:p&gt;&lt;w:p&gt;&lt;w:pPr&gt;&lt;w:spacing w:before="0" w:after="0"/&gt;&lt;/w:pPr&gt;&lt;w:r&gt;&lt;w:rPr&gt;&lt;/w:rPr&gt;&lt;w:t xml:space="preserve"&gt;{{company.postal_code}} {{company.city}}, {{company.country}}&lt;/w:t&gt;&lt;/w:r&gt;&lt;/w:p&gt;&lt;w:p&gt;&lt;w:pPr&gt;&lt;w:spacing w:before="0" w:after="0"/&gt;&lt;/w:pPr&gt;&lt;w:r&gt;&lt;w:rPr&gt;&lt;/w:rPr&gt;&lt;w:t xml:space="preserve"&gt;{{company.email}}  {{company.phone}}&lt;/w:t&gt;&lt;/w:r&gt;&lt;/w:p&gt;&lt;w:p&gt;&lt;w:pPr&gt;&lt;w:spacing w:before="0" w:after="0"/&gt;&lt;/w:pPr&gt;&lt;w:r&gt;&lt;w:rPr&gt;&lt;/w:rPr&gt;&lt;w:t xml:space="preserve"&gt;{{#company.tax_id}}Tax ID: {{company.tax_id}}{{/company.tax_id}}&lt;/w:t&gt;&lt;/w:r&gt;&lt;/w:p&gt;</w:t>
+              <w:rPr>
+                <w:b/>
+                <w:sz w:val="24"/>
+                <w:szCs w:val="24"/>
+              </w:rPr>
+              <w:t xml:space="preserve">{{company.name}}</w:t>
+            </w:r>
+          </w:p>
+          <w:p>
+            <w:pPr>
+              <w:spacing w:before="0" w:after="0"/>
+            </w:pPr>
+            <w:r>
+              <w:rPr/>
+              <w:t xml:space="preserve">{{company.address1}}</w:t>
+            </w:r>
+          </w:p>
+          <w:p>
+            <w:pPr>
+              <w:spacing w:before="0" w:after="0"/>
+            </w:pPr>
+            <w:r>
+              <w:rPr/>
+              <w:t xml:space="preserve">{{company.postal_code}} {{company.city}}, {{company.country}}</w:t>
+            </w:r>
+          </w:p>
+          <w:p>
+            <w:pPr>
+              <w:spacing w:before="0" w:after="0"/>
+            </w:pPr>
+            <w:r>
+              <w:rPr/>
+              <w:t xml:space="preserve">{{company.email}}  {{company.phone}}</w:t>
+            </w:r>
+          </w:p>
+          <w:p>
+            <w:pPr>
+              <w:spacing w:before="0" w:after="0"/>
+            </w:pPr>
+            <w:r>
+              <w:rPr/>
+              <w:t xml:space="preserve">{{#company.tax_id}}Tax ID: {{company.tax_id}}{{/company.tax_id}}</w:t>
             </w:r>
           </w:p>
         </w:tc>
@@ -88,8 +128,49 @@
               <w:spacing w:before="0" w:after="0"/>
             </w:pPr>
             <w:r>
-              <w:rPr/>
-              <w:t xml:space="preserve">&lt;w:p&gt;&lt;w:pPr&gt;&lt;w:spacing w:before="0" w:after="0"/&gt;&lt;/w:pPr&gt;&lt;w:r&gt;&lt;w:rPr&gt;&lt;w:b/&gt;&lt;w:color w:val="666666"/&gt;&lt;/w:rPr&gt;&lt;w:t xml:space="preserve"&gt;Bill to&lt;/w:t&gt;&lt;/w:r&gt;&lt;/w:p&gt;&lt;w:p&gt;&lt;w:pPr&gt;&lt;w:spacing w:before="0" w:after="0"/&gt;&lt;/w:pPr&gt;&lt;w:r&gt;&lt;w:rPr&gt;&lt;w:b/&gt;&lt;/w:rPr&gt;&lt;w:t xml:space="preserve"&gt;{{client.name}}&lt;/w:t&gt;&lt;/w:r&gt;&lt;/w:p&gt;&lt;w:p&gt;&lt;w:pPr&gt;&lt;w:spacing w:before="0" w:after="0"/&gt;&lt;/w:pPr&gt;&lt;w:r&gt;&lt;w:rPr&gt;&lt;/w:rPr&gt;&lt;w:t xml:space="preserve"&gt;{{client.contact}}&lt;/w:t&gt;&lt;/w:r&gt;&lt;/w:p&gt;&lt;w:p&gt;&lt;w:pPr&gt;&lt;w:spacing w:before="0" w:after="0"/&gt;&lt;/w:pPr&gt;&lt;w:r&gt;&lt;w:rPr&gt;&lt;/w:rPr&gt;&lt;w:t xml:space="preserve"&gt;{{client.address}}&lt;/w:t&gt;&lt;/w:r&gt;&lt;/w:p&gt;&lt;w:p&gt;&lt;w:pPr&gt;&lt;w:spacing w:before="0" w:after="0"/&gt;&lt;/w:pPr&gt;&lt;w:r&gt;&lt;w:rPr&gt;&lt;/w:rPr&gt;&lt;w:t xml:space="preserve"&gt;{{client.email}}&lt;/w:t&gt;&lt;/w:r&gt;&lt;/w:p&gt;</w:t>
+              <w:rPr>
+                <w:b/>
+                <w:color w:val="666666"/>
+              </w:rPr>
+              <w:t xml:space="preserve">Bill to</w:t>
+            </w:r>
+          </w:p>
+          <w:p>
+            <w:pPr>
+              <w:spacing w:before="0" w:after="0"/>
+            </w:pPr>
+            <w:r>
+              <w:rPr>
+                <w:b/>
+              </w:rPr>
+              <w:t xml:space="preserve">{{client.name}}</w:t>
+            </w:r>
+          </w:p>
+          <w:p>
+            <w:pPr>
+              <w:spacing w:before="0" w:after="0"/>
+            </w:pPr>
+            <w:r>
+              <w:rPr/>
+              <w:t xml:space="preserve">{{client.contact}}</w:t>
+            </w:r>
+          </w:p>
+          <w:p>
+            <w:pPr>
+              <w:spacing w:before="0" w:after="0"/>
+            </w:pPr>
+            <w:r>
+              <w:rPr/>
+              <w:t xml:space="preserve">{{client.address}}</w:t>
+            </w:r>
+          </w:p>
+          <w:p>
+            <w:pPr>
+              <w:spacing w:before="0" w:after="0"/>
+            </w:pPr>
+            <w:r>
+              <w:rPr/>
+              <w:t xml:space="preserve">{{client.email}}</w:t>
             </w:r>
           </w:p>
         </w:tc>

</xml_diff>